<commit_message>
Fit testimony on two pages
Co-Authored-By: Claude Fable 5.1 <noreply@anthropic.com>
Claude-Session: https://claude.ai/code/session_01DfqmJDEjm2Gwtio86GAUCf
</commit_message>
<xml_diff>
--- a/documents/Levasseur_Testimony_ZBA2026-063.docx
+++ b/documents/Levasseur_Testimony_ZBA2026-063.docx
@@ -35,7 +35,7 @@
     </w:p>
     <w:p>
       <w:pPr>
-        <w:spacing w:after="130" w:line="320"/>
+        <w:spacing w:after="110" w:line="310"/>
       </w:pPr>
       <w:r>
         <w:rPr>
@@ -47,7 +47,7 @@
     </w:p>
     <w:p>
       <w:pPr>
-        <w:spacing w:after="130" w:line="320"/>
+        <w:spacing w:after="110" w:line="310"/>
       </w:pPr>
       <w:r>
         <w:rPr>
@@ -59,7 +59,7 @@
     </w:p>
     <w:p>
       <w:pPr>
-        <w:spacing w:after="130" w:line="320"/>
+        <w:spacing w:after="110" w:line="310"/>
       </w:pPr>
       <w:r>
         <w:rPr>
@@ -71,7 +71,7 @@
     </w:p>
     <w:p>
       <w:pPr>
-        <w:spacing w:after="130" w:line="320"/>
+        <w:spacing w:after="110" w:line="310"/>
       </w:pPr>
       <w:r>
         <w:rPr>
@@ -83,7 +83,7 @@
     </w:p>
     <w:p>
       <w:pPr>
-        <w:spacing w:after="130" w:line="320"/>
+        <w:spacing w:after="110" w:line="310"/>
       </w:pPr>
       <w:r>
         <w:rPr>
@@ -95,7 +95,7 @@
     </w:p>
     <w:p>
       <w:pPr>
-        <w:spacing w:after="130" w:line="320"/>
+        <w:spacing w:after="110" w:line="310"/>
       </w:pPr>
       <w:r>
         <w:rPr>
@@ -116,7 +116,7 @@
     </w:p>
     <w:p>
       <w:pPr>
-        <w:spacing w:after="130" w:line="320"/>
+        <w:spacing w:after="110" w:line="310"/>
       </w:pPr>
       <w:r>
         <w:rPr>
@@ -128,7 +128,7 @@
     </w:p>
     <w:p>
       <w:pPr>
-        <w:spacing w:after="130" w:line="320"/>
+        <w:spacing w:after="110" w:line="310"/>
       </w:pPr>
       <w:r>
         <w:rPr>
@@ -156,7 +156,7 @@
     </w:p>
     <w:p>
       <w:pPr>
-        <w:spacing w:after="130" w:line="320"/>
+        <w:spacing w:after="110" w:line="310"/>
       </w:pPr>
       <w:r>
         <w:rPr>
@@ -177,7 +177,7 @@
     </w:p>
     <w:p>
       <w:pPr>
-        <w:spacing w:after="130" w:line="320"/>
+        <w:spacing w:after="110" w:line="310"/>
       </w:pPr>
       <w:r>
         <w:rPr>
@@ -189,7 +189,7 @@
     </w:p>
     <w:p>
       <w:pPr>
-        <w:spacing w:after="130" w:line="320"/>
+        <w:spacing w:after="110" w:line="310"/>
       </w:pPr>
       <w:r>
         <w:rPr>
@@ -210,7 +210,7 @@
     </w:p>
     <w:p>
       <w:pPr>
-        <w:spacing w:after="130" w:line="320"/>
+        <w:spacing w:after="110" w:line="310"/>
       </w:pPr>
       <w:r>
         <w:rPr>
@@ -222,7 +222,7 @@
     </w:p>
     <w:p>
       <w:pPr>
-        <w:spacing w:after="130" w:line="320"/>
+        <w:spacing w:after="110" w:line="310"/>
       </w:pPr>
       <w:r>
         <w:rPr>
@@ -250,7 +250,7 @@
     </w:p>
     <w:p>
       <w:pPr>
-        <w:spacing w:after="130" w:line="320"/>
+        <w:spacing w:after="110" w:line="310"/>
       </w:pPr>
       <w:r>
         <w:rPr>

</xml_diff>

<commit_message>
Add signature block to testimony, co-signed by Alison Famisan-Levasseur
Co-Authored-By: Claude Fable 5.1 <noreply@anthropic.com>
Claude-Session: https://claude.ai/code/session_01DfqmJDEjm2Gwtio86GAUCf
</commit_message>
<xml_diff>
--- a/documents/Levasseur_Testimony_ZBA2026-063.docx
+++ b/documents/Levasseur_Testimony_ZBA2026-063.docx
@@ -35,7 +35,7 @@
     </w:p>
     <w:p>
       <w:pPr>
-        <w:spacing w:after="110" w:line="310"/>
+        <w:spacing w:after="100" w:line="300"/>
       </w:pPr>
       <w:r>
         <w:rPr>
@@ -47,7 +47,7 @@
     </w:p>
     <w:p>
       <w:pPr>
-        <w:spacing w:after="110" w:line="310"/>
+        <w:spacing w:after="100" w:line="300"/>
       </w:pPr>
       <w:r>
         <w:rPr>
@@ -59,7 +59,7 @@
     </w:p>
     <w:p>
       <w:pPr>
-        <w:spacing w:after="110" w:line="310"/>
+        <w:spacing w:after="100" w:line="300"/>
       </w:pPr>
       <w:r>
         <w:rPr>
@@ -71,7 +71,7 @@
     </w:p>
     <w:p>
       <w:pPr>
-        <w:spacing w:after="110" w:line="310"/>
+        <w:spacing w:after="100" w:line="300"/>
       </w:pPr>
       <w:r>
         <w:rPr>
@@ -83,7 +83,7 @@
     </w:p>
     <w:p>
       <w:pPr>
-        <w:spacing w:after="110" w:line="310"/>
+        <w:spacing w:after="100" w:line="300"/>
       </w:pPr>
       <w:r>
         <w:rPr>
@@ -95,7 +95,7 @@
     </w:p>
     <w:p>
       <w:pPr>
-        <w:spacing w:after="110" w:line="310"/>
+        <w:spacing w:after="100" w:line="300"/>
       </w:pPr>
       <w:r>
         <w:rPr>
@@ -116,7 +116,7 @@
     </w:p>
     <w:p>
       <w:pPr>
-        <w:spacing w:after="110" w:line="310"/>
+        <w:spacing w:after="100" w:line="300"/>
       </w:pPr>
       <w:r>
         <w:rPr>
@@ -128,7 +128,7 @@
     </w:p>
     <w:p>
       <w:pPr>
-        <w:spacing w:after="110" w:line="310"/>
+        <w:spacing w:after="100" w:line="300"/>
       </w:pPr>
       <w:r>
         <w:rPr>
@@ -156,7 +156,7 @@
     </w:p>
     <w:p>
       <w:pPr>
-        <w:spacing w:after="110" w:line="310"/>
+        <w:spacing w:after="100" w:line="300"/>
       </w:pPr>
       <w:r>
         <w:rPr>
@@ -177,7 +177,7 @@
     </w:p>
     <w:p>
       <w:pPr>
-        <w:spacing w:after="110" w:line="310"/>
+        <w:spacing w:after="100" w:line="300"/>
       </w:pPr>
       <w:r>
         <w:rPr>
@@ -189,7 +189,7 @@
     </w:p>
     <w:p>
       <w:pPr>
-        <w:spacing w:after="110" w:line="310"/>
+        <w:spacing w:after="100" w:line="300"/>
       </w:pPr>
       <w:r>
         <w:rPr>
@@ -210,7 +210,7 @@
     </w:p>
     <w:p>
       <w:pPr>
-        <w:spacing w:after="110" w:line="310"/>
+        <w:spacing w:after="100" w:line="300"/>
       </w:pPr>
       <w:r>
         <w:rPr>
@@ -222,7 +222,7 @@
     </w:p>
     <w:p>
       <w:pPr>
-        <w:spacing w:after="110" w:line="310"/>
+        <w:spacing w:after="100" w:line="300"/>
       </w:pPr>
       <w:r>
         <w:rPr>
@@ -250,7 +250,7 @@
     </w:p>
     <w:p>
       <w:pPr>
-        <w:spacing w:after="110" w:line="310"/>
+        <w:spacing w:after="100" w:line="300"/>
       </w:pPr>
       <w:r>
         <w:rPr>
@@ -260,9 +260,159 @@
         <w:t xml:space="preserve">Thank you.</w:t>
       </w:r>
     </w:p>
+    <w:p>
+      <w:pPr>
+        <w:spacing w:after="60"/>
+      </w:pPr>
+    </w:p>
+    <w:p>
+      <w:pPr>
+        <w:spacing w:after="160"/>
+      </w:pPr>
+      <w:r>
+        <w:rPr>
+          <w:i/>
+          <w:iCs/>
+          <w:sz w:val="24"/>
+          <w:szCs w:val="24"/>
+        </w:rPr>
+        <w:t xml:space="preserve">Respectfully submitted,</w:t>
+      </w:r>
+    </w:p>
+    <w:tbl>
+      <w:tblPr>
+        <w:tblW w:type="dxa" w:w="10440"/>
+        <w:tblBorders>
+          <w:top w:val="none"/>
+          <w:left w:val="none"/>
+          <w:bottom w:val="none"/>
+          <w:right w:val="none"/>
+          <w:insideH w:val="none"/>
+          <w:insideV w:val="none"/>
+        </w:tblBorders>
+      </w:tblPr>
+      <w:tblGrid>
+        <w:gridCol w:w="5220"/>
+        <w:gridCol w:w="5220"/>
+      </w:tblGrid>
+      <w:tr>
+        <w:tc>
+          <w:tcPr>
+            <w:tcW w:type="dxa" w:w="5220"/>
+          </w:tcPr>
+          <w:p>
+            <w:pPr>
+              <w:spacing w:after="0"/>
+            </w:pPr>
+            <w:r>
+              <w:rPr>
+                <w:b/>
+                <w:bCs/>
+                <w:sz w:val="24"/>
+                <w:szCs w:val="24"/>
+              </w:rPr>
+              <w:t xml:space="preserve">Nickolas Levasseur</w:t>
+            </w:r>
+          </w:p>
+          <w:p>
+            <w:pPr>
+              <w:spacing w:after="0"/>
+            </w:pPr>
+            <w:r>
+              <w:rPr>
+                <w:sz w:val="24"/>
+                <w:szCs w:val="24"/>
+              </w:rPr>
+              <w:t xml:space="preserve">Former State Representative</w:t>
+            </w:r>
+          </w:p>
+          <w:p>
+            <w:pPr>
+              <w:spacing w:after="0"/>
+            </w:pPr>
+            <w:r>
+              <w:rPr>
+                <w:sz w:val="24"/>
+                <w:szCs w:val="24"/>
+              </w:rPr>
+              <w:t xml:space="preserve">Resident, 30 Mystic Street</w:t>
+            </w:r>
+          </w:p>
+          <w:p>
+            <w:pPr>
+              <w:spacing w:after="0"/>
+            </w:pPr>
+            <w:r>
+              <w:rPr>
+                <w:sz w:val="24"/>
+                <w:szCs w:val="24"/>
+              </w:rPr>
+              <w:t xml:space="preserve">Manchester, NH 03103</w:t>
+            </w:r>
+          </w:p>
+        </w:tc>
+        <w:tc>
+          <w:tcPr>
+            <w:tcW w:type="dxa" w:w="5220"/>
+          </w:tcPr>
+          <w:p>
+            <w:pPr>
+              <w:spacing w:after="0"/>
+            </w:pPr>
+            <w:r>
+              <w:rPr>
+                <w:i/>
+                <w:iCs/>
+                <w:sz w:val="24"/>
+                <w:szCs w:val="24"/>
+              </w:rPr>
+              <w:t xml:space="preserve">Co-signed by:</w:t>
+            </w:r>
+          </w:p>
+          <w:p>
+            <w:pPr>
+              <w:spacing w:after="0"/>
+            </w:pPr>
+            <w:r>
+              <w:rPr>
+                <w:b/>
+                <w:bCs/>
+                <w:sz w:val="24"/>
+                <w:szCs w:val="24"/>
+              </w:rPr>
+              <w:t xml:space="preserve">Alison Famisan-Levasseur</w:t>
+            </w:r>
+          </w:p>
+          <w:p>
+            <w:pPr>
+              <w:spacing w:after="0"/>
+            </w:pPr>
+            <w:r>
+              <w:rPr>
+                <w:sz w:val="24"/>
+                <w:szCs w:val="24"/>
+              </w:rPr>
+              <w:t xml:space="preserve">Resident, 30 Mystic Street</w:t>
+            </w:r>
+          </w:p>
+          <w:p>
+            <w:pPr>
+              <w:spacing w:after="0"/>
+            </w:pPr>
+            <w:r>
+              <w:rPr>
+                <w:sz w:val="24"/>
+                <w:szCs w:val="24"/>
+              </w:rPr>
+              <w:t xml:space="preserve">Manchester, NH 03103</w:t>
+            </w:r>
+          </w:p>
+        </w:tc>
+      </w:tr>
+    </w:tbl>
     <w:sectPr>
       <w:pgSz w:w="12240" w:h="15840" w:orient="portrait"/>
-      <w:pgMar w:top="560" w:right="900" w:bottom="560" w:left="900" w:header="708" w:footer="708" w:gutter="0"/>
+      <w:pgMar w:top="500" w:right="900" w:bottom="500" w:left="900" w:header="708" w:footer="708" w:gutter="0"/>
       <w:pgNumType/>
       <w:docGrid w:linePitch="360"/>
     </w:sectPr>

</xml_diff>

<commit_message>
Add attachments line to testimony
Co-Authored-By: Claude Fable 5.1 <noreply@anthropic.com>
Claude-Session: https://claude.ai/code/session_01DfqmJDEjm2Gwtio86GAUCf
</commit_message>
<xml_diff>
--- a/documents/Levasseur_Testimony_ZBA2026-063.docx
+++ b/documents/Levasseur_Testimony_ZBA2026-063.docx
@@ -262,12 +262,7 @@
     </w:p>
     <w:p>
       <w:pPr>
-        <w:spacing w:after="60"/>
-      </w:pPr>
-    </w:p>
-    <w:p>
-      <w:pPr>
-        <w:spacing w:after="160"/>
+        <w:spacing w:before="40" w:after="100"/>
       </w:pPr>
       <w:r>
         <w:rPr>
@@ -410,6 +405,27 @@
         </w:tc>
       </w:tr>
     </w:tbl>
+    <w:p>
+      <w:pPr>
+        <w:spacing w:before="100" w:after="0"/>
+      </w:pPr>
+      <w:r>
+        <w:rPr>
+          <w:b/>
+          <w:bCs/>
+          <w:sz w:val="22"/>
+          <w:szCs w:val="22"/>
+        </w:rPr>
+        <w:t xml:space="preserve">Attachments: </w:t>
+      </w:r>
+      <w:r>
+        <w:rPr>
+          <w:sz w:val="22"/>
+          <w:szCs w:val="22"/>
+        </w:rPr>
+        <w:t xml:space="preserve">Memorandum — citations and case law</w:t>
+      </w:r>
+    </w:p>
     <w:sectPr>
       <w:pgSz w:w="12240" w:h="15840" w:orient="portrait"/>
       <w:pgMar w:top="500" w:right="900" w:bottom="500" w:left="900" w:header="708" w:footer="708" w:gutter="0"/>

</xml_diff>